<commit_message>
lab 2: ngon ngu HTML
</commit_message>
<xml_diff>
--- a/Buoi3-25150611-Lê Huy Nghĩa.docx
+++ b/Buoi3-25150611-Lê Huy Nghĩa.docx
@@ -35,6 +35,25 @@
         <w:rPr>
           <w:b/>
           <w:bCs/>
+          <w:sz w:val="48"/>
+          <w:szCs w:val="48"/>
+        </w:rPr>
+      </w:pPr>
+      <w:r>
+        <w:rPr>
+          <w:b/>
+          <w:bCs/>
+          <w:sz w:val="48"/>
+          <w:szCs w:val="48"/>
+        </w:rPr>
+        <w:t>Bài 3</w:t>
+      </w:r>
+    </w:p>
+    <w:p>
+      <w:pPr>
+        <w:rPr>
+          <w:b/>
+          <w:bCs/>
           <w:szCs w:val="28"/>
         </w:rPr>
       </w:pPr>
@@ -46,15 +65,14 @@
         </w:rPr>
         <w:t>17. Thêm form vào contact.html theo template trên. Chia 2 fieldset: 'Thông tin</w:t>
       </w:r>
-    </w:p>
-    <w:p>
-      <w:pPr>
-        <w:rPr>
-          <w:b/>
-          <w:bCs/>
-          <w:szCs w:val="28"/>
-        </w:rPr>
-      </w:pPr>
+      <w:r>
+        <w:rPr>
+          <w:b/>
+          <w:bCs/>
+          <w:szCs w:val="28"/>
+        </w:rPr>
+        <w:t xml:space="preserve"> </w:t>
+      </w:r>
       <w:r>
         <w:rPr>
           <w:b/>
@@ -1261,6 +1279,992 @@
           </wp:inline>
         </w:drawing>
       </w:r>
+    </w:p>
+    <w:p>
+      <w:pPr>
+        <w:rPr>
+          <w:b/>
+          <w:bCs/>
+          <w:sz w:val="48"/>
+          <w:szCs w:val="48"/>
+        </w:rPr>
+      </w:pPr>
+      <w:r>
+        <w:rPr>
+          <w:b/>
+          <w:bCs/>
+          <w:sz w:val="48"/>
+          <w:szCs w:val="48"/>
+        </w:rPr>
+        <w:t xml:space="preserve">Bài </w:t>
+      </w:r>
+      <w:r>
+        <w:rPr>
+          <w:b/>
+          <w:bCs/>
+          <w:sz w:val="48"/>
+          <w:szCs w:val="48"/>
+        </w:rPr>
+        <w:t>4</w:t>
+      </w:r>
+    </w:p>
+    <w:p>
+      <w:pPr>
+        <w:rPr>
+          <w:b/>
+          <w:bCs/>
+          <w:szCs w:val="28"/>
+        </w:rPr>
+      </w:pPr>
+      <w:r>
+        <w:rPr>
+          <w:b/>
+          <w:bCs/>
+          <w:szCs w:val="28"/>
+        </w:rPr>
+        <w:t>25. Cập nhật &lt;title&gt; riêng biệt cho cả 3 trang: index.html, about.html,</w:t>
+      </w:r>
+    </w:p>
+    <w:p>
+      <w:pPr>
+        <w:rPr>
+          <w:b/>
+          <w:bCs/>
+          <w:szCs w:val="28"/>
+        </w:rPr>
+      </w:pPr>
+      <w:r>
+        <w:rPr>
+          <w:b/>
+          <w:bCs/>
+          <w:szCs w:val="28"/>
+        </w:rPr>
+        <w:t>contact.html (50–60 ký tự, có tên bạn).</w:t>
+      </w:r>
+    </w:p>
+    <w:p>
+      <w:pPr>
+        <w:rPr>
+          <w:b/>
+          <w:bCs/>
+          <w:szCs w:val="28"/>
+        </w:rPr>
+      </w:pPr>
+      <w:r>
+        <w:rPr>
+          <w:b/>
+          <w:bCs/>
+          <w:szCs w:val="28"/>
+        </w:rPr>
+        <w:drawing>
+          <wp:inline distT="0" distB="0" distL="0" distR="0" wp14:anchorId="5AE0D805" wp14:editId="4CD8D4A3">
+            <wp:extent cx="5760720" cy="1595755"/>
+            <wp:effectExtent l="0" t="0" r="0" b="4445"/>
+            <wp:docPr id="1002453671" name="Picture 1"/>
+            <wp:cNvGraphicFramePr>
+              <a:graphicFrameLocks xmlns:a="http://schemas.openxmlformats.org/drawingml/2006/main" noChangeAspect="1"/>
+            </wp:cNvGraphicFramePr>
+            <a:graphic xmlns:a="http://schemas.openxmlformats.org/drawingml/2006/main">
+              <a:graphicData uri="http://schemas.openxmlformats.org/drawingml/2006/picture">
+                <pic:pic xmlns:pic="http://schemas.openxmlformats.org/drawingml/2006/picture">
+                  <pic:nvPicPr>
+                    <pic:cNvPr id="1002453671" name=""/>
+                    <pic:cNvPicPr/>
+                  </pic:nvPicPr>
+                  <pic:blipFill>
+                    <a:blip r:embed="rId23"/>
+                    <a:stretch>
+                      <a:fillRect/>
+                    </a:stretch>
+                  </pic:blipFill>
+                  <pic:spPr>
+                    <a:xfrm>
+                      <a:off x="0" y="0"/>
+                      <a:ext cx="5760720" cy="1595755"/>
+                    </a:xfrm>
+                    <a:prstGeom prst="rect">
+                      <a:avLst/>
+                    </a:prstGeom>
+                  </pic:spPr>
+                </pic:pic>
+              </a:graphicData>
+            </a:graphic>
+          </wp:inline>
+        </w:drawing>
+      </w:r>
+    </w:p>
+    <w:p>
+      <w:pPr>
+        <w:rPr>
+          <w:b/>
+          <w:bCs/>
+          <w:szCs w:val="28"/>
+        </w:rPr>
+      </w:pPr>
+      <w:r>
+        <w:rPr>
+          <w:b/>
+          <w:bCs/>
+          <w:szCs w:val="28"/>
+        </w:rPr>
+        <w:drawing>
+          <wp:inline distT="0" distB="0" distL="0" distR="0" wp14:anchorId="4098534E" wp14:editId="7CD26C2B">
+            <wp:extent cx="5760720" cy="1567815"/>
+            <wp:effectExtent l="0" t="0" r="0" b="0"/>
+            <wp:docPr id="210369379" name="Picture 1"/>
+            <wp:cNvGraphicFramePr>
+              <a:graphicFrameLocks xmlns:a="http://schemas.openxmlformats.org/drawingml/2006/main" noChangeAspect="1"/>
+            </wp:cNvGraphicFramePr>
+            <a:graphic xmlns:a="http://schemas.openxmlformats.org/drawingml/2006/main">
+              <a:graphicData uri="http://schemas.openxmlformats.org/drawingml/2006/picture">
+                <pic:pic xmlns:pic="http://schemas.openxmlformats.org/drawingml/2006/picture">
+                  <pic:nvPicPr>
+                    <pic:cNvPr id="210369379" name=""/>
+                    <pic:cNvPicPr/>
+                  </pic:nvPicPr>
+                  <pic:blipFill>
+                    <a:blip r:embed="rId24"/>
+                    <a:stretch>
+                      <a:fillRect/>
+                    </a:stretch>
+                  </pic:blipFill>
+                  <pic:spPr>
+                    <a:xfrm>
+                      <a:off x="0" y="0"/>
+                      <a:ext cx="5760720" cy="1567815"/>
+                    </a:xfrm>
+                    <a:prstGeom prst="rect">
+                      <a:avLst/>
+                    </a:prstGeom>
+                  </pic:spPr>
+                </pic:pic>
+              </a:graphicData>
+            </a:graphic>
+          </wp:inline>
+        </w:drawing>
+      </w:r>
+    </w:p>
+    <w:p>
+      <w:pPr>
+        <w:rPr>
+          <w:b/>
+          <w:bCs/>
+          <w:szCs w:val="28"/>
+        </w:rPr>
+      </w:pPr>
+      <w:r>
+        <w:rPr>
+          <w:b/>
+          <w:bCs/>
+          <w:szCs w:val="28"/>
+        </w:rPr>
+        <w:lastRenderedPageBreak/>
+        <w:drawing>
+          <wp:inline distT="0" distB="0" distL="0" distR="0" wp14:anchorId="259A6982" wp14:editId="4531EA43">
+            <wp:extent cx="5760720" cy="1534160"/>
+            <wp:effectExtent l="0" t="0" r="0" b="8890"/>
+            <wp:docPr id="433485536" name="Picture 1"/>
+            <wp:cNvGraphicFramePr>
+              <a:graphicFrameLocks xmlns:a="http://schemas.openxmlformats.org/drawingml/2006/main" noChangeAspect="1"/>
+            </wp:cNvGraphicFramePr>
+            <a:graphic xmlns:a="http://schemas.openxmlformats.org/drawingml/2006/main">
+              <a:graphicData uri="http://schemas.openxmlformats.org/drawingml/2006/picture">
+                <pic:pic xmlns:pic="http://schemas.openxmlformats.org/drawingml/2006/picture">
+                  <pic:nvPicPr>
+                    <pic:cNvPr id="433485536" name=""/>
+                    <pic:cNvPicPr/>
+                  </pic:nvPicPr>
+                  <pic:blipFill>
+                    <a:blip r:embed="rId25"/>
+                    <a:stretch>
+                      <a:fillRect/>
+                    </a:stretch>
+                  </pic:blipFill>
+                  <pic:spPr>
+                    <a:xfrm>
+                      <a:off x="0" y="0"/>
+                      <a:ext cx="5760720" cy="1534160"/>
+                    </a:xfrm>
+                    <a:prstGeom prst="rect">
+                      <a:avLst/>
+                    </a:prstGeom>
+                  </pic:spPr>
+                </pic:pic>
+              </a:graphicData>
+            </a:graphic>
+          </wp:inline>
+        </w:drawing>
+      </w:r>
+    </w:p>
+    <w:p>
+      <w:pPr>
+        <w:rPr>
+          <w:b/>
+          <w:bCs/>
+          <w:szCs w:val="28"/>
+        </w:rPr>
+      </w:pPr>
+      <w:r>
+        <w:rPr>
+          <w:b/>
+          <w:bCs/>
+          <w:szCs w:val="28"/>
+        </w:rPr>
+        <w:t>26. Thêm &lt;meta name="description"&gt; cho mỗi trang (150–160 ký tự, bắt đầu</w:t>
+      </w:r>
+    </w:p>
+    <w:p>
+      <w:pPr>
+        <w:rPr>
+          <w:b/>
+          <w:bCs/>
+          <w:szCs w:val="28"/>
+        </w:rPr>
+      </w:pPr>
+      <w:r>
+        <w:rPr>
+          <w:b/>
+          <w:bCs/>
+          <w:szCs w:val="28"/>
+        </w:rPr>
+        <w:t>bằng mô tả hành động).</w:t>
+      </w:r>
+    </w:p>
+    <w:p>
+      <w:pPr>
+        <w:rPr>
+          <w:b/>
+          <w:bCs/>
+          <w:szCs w:val="28"/>
+        </w:rPr>
+      </w:pPr>
+      <w:r>
+        <w:rPr>
+          <w:b/>
+          <w:bCs/>
+          <w:szCs w:val="28"/>
+        </w:rPr>
+        <w:drawing>
+          <wp:inline distT="0" distB="0" distL="0" distR="0" wp14:anchorId="3E51BFB6" wp14:editId="0093EFA0">
+            <wp:extent cx="5760720" cy="1652905"/>
+            <wp:effectExtent l="0" t="0" r="0" b="4445"/>
+            <wp:docPr id="635936194" name="Picture 1"/>
+            <wp:cNvGraphicFramePr>
+              <a:graphicFrameLocks xmlns:a="http://schemas.openxmlformats.org/drawingml/2006/main" noChangeAspect="1"/>
+            </wp:cNvGraphicFramePr>
+            <a:graphic xmlns:a="http://schemas.openxmlformats.org/drawingml/2006/main">
+              <a:graphicData uri="http://schemas.openxmlformats.org/drawingml/2006/picture">
+                <pic:pic xmlns:pic="http://schemas.openxmlformats.org/drawingml/2006/picture">
+                  <pic:nvPicPr>
+                    <pic:cNvPr id="635936194" name=""/>
+                    <pic:cNvPicPr/>
+                  </pic:nvPicPr>
+                  <pic:blipFill>
+                    <a:blip r:embed="rId26"/>
+                    <a:stretch>
+                      <a:fillRect/>
+                    </a:stretch>
+                  </pic:blipFill>
+                  <pic:spPr>
+                    <a:xfrm>
+                      <a:off x="0" y="0"/>
+                      <a:ext cx="5760720" cy="1652905"/>
+                    </a:xfrm>
+                    <a:prstGeom prst="rect">
+                      <a:avLst/>
+                    </a:prstGeom>
+                  </pic:spPr>
+                </pic:pic>
+              </a:graphicData>
+            </a:graphic>
+          </wp:inline>
+        </w:drawing>
+      </w:r>
+    </w:p>
+    <w:p>
+      <w:pPr>
+        <w:rPr>
+          <w:b/>
+          <w:bCs/>
+          <w:szCs w:val="28"/>
+        </w:rPr>
+      </w:pPr>
+      <w:r>
+        <w:rPr>
+          <w:b/>
+          <w:bCs/>
+          <w:szCs w:val="28"/>
+        </w:rPr>
+        <w:drawing>
+          <wp:inline distT="0" distB="0" distL="0" distR="0" wp14:anchorId="1AA7C573" wp14:editId="5C9C9134">
+            <wp:extent cx="5760720" cy="1583055"/>
+            <wp:effectExtent l="0" t="0" r="0" b="0"/>
+            <wp:docPr id="1756776909" name="Picture 1"/>
+            <wp:cNvGraphicFramePr>
+              <a:graphicFrameLocks xmlns:a="http://schemas.openxmlformats.org/drawingml/2006/main" noChangeAspect="1"/>
+            </wp:cNvGraphicFramePr>
+            <a:graphic xmlns:a="http://schemas.openxmlformats.org/drawingml/2006/main">
+              <a:graphicData uri="http://schemas.openxmlformats.org/drawingml/2006/picture">
+                <pic:pic xmlns:pic="http://schemas.openxmlformats.org/drawingml/2006/picture">
+                  <pic:nvPicPr>
+                    <pic:cNvPr id="1756776909" name=""/>
+                    <pic:cNvPicPr/>
+                  </pic:nvPicPr>
+                  <pic:blipFill>
+                    <a:blip r:embed="rId27"/>
+                    <a:stretch>
+                      <a:fillRect/>
+                    </a:stretch>
+                  </pic:blipFill>
+                  <pic:spPr>
+                    <a:xfrm>
+                      <a:off x="0" y="0"/>
+                      <a:ext cx="5760720" cy="1583055"/>
+                    </a:xfrm>
+                    <a:prstGeom prst="rect">
+                      <a:avLst/>
+                    </a:prstGeom>
+                  </pic:spPr>
+                </pic:pic>
+              </a:graphicData>
+            </a:graphic>
+          </wp:inline>
+        </w:drawing>
+      </w:r>
+    </w:p>
+    <w:p>
+      <w:pPr>
+        <w:rPr>
+          <w:b/>
+          <w:bCs/>
+          <w:szCs w:val="28"/>
+        </w:rPr>
+      </w:pPr>
+      <w:r>
+        <w:rPr>
+          <w:b/>
+          <w:bCs/>
+          <w:szCs w:val="28"/>
+        </w:rPr>
+        <w:drawing>
+          <wp:inline distT="0" distB="0" distL="0" distR="0" wp14:anchorId="45E3A819" wp14:editId="232B5AD4">
+            <wp:extent cx="5760720" cy="1771015"/>
+            <wp:effectExtent l="0" t="0" r="0" b="635"/>
+            <wp:docPr id="1640531600" name="Picture 1"/>
+            <wp:cNvGraphicFramePr>
+              <a:graphicFrameLocks xmlns:a="http://schemas.openxmlformats.org/drawingml/2006/main" noChangeAspect="1"/>
+            </wp:cNvGraphicFramePr>
+            <a:graphic xmlns:a="http://schemas.openxmlformats.org/drawingml/2006/main">
+              <a:graphicData uri="http://schemas.openxmlformats.org/drawingml/2006/picture">
+                <pic:pic xmlns:pic="http://schemas.openxmlformats.org/drawingml/2006/picture">
+                  <pic:nvPicPr>
+                    <pic:cNvPr id="1640531600" name=""/>
+                    <pic:cNvPicPr/>
+                  </pic:nvPicPr>
+                  <pic:blipFill>
+                    <a:blip r:embed="rId28"/>
+                    <a:stretch>
+                      <a:fillRect/>
+                    </a:stretch>
+                  </pic:blipFill>
+                  <pic:spPr>
+                    <a:xfrm>
+                      <a:off x="0" y="0"/>
+                      <a:ext cx="5760720" cy="1771015"/>
+                    </a:xfrm>
+                    <a:prstGeom prst="rect">
+                      <a:avLst/>
+                    </a:prstGeom>
+                  </pic:spPr>
+                </pic:pic>
+              </a:graphicData>
+            </a:graphic>
+          </wp:inline>
+        </w:drawing>
+      </w:r>
+    </w:p>
+    <w:p>
+      <w:pPr>
+        <w:rPr>
+          <w:b/>
+          <w:bCs/>
+          <w:szCs w:val="28"/>
+        </w:rPr>
+      </w:pPr>
+      <w:r>
+        <w:rPr>
+          <w:b/>
+          <w:bCs/>
+          <w:szCs w:val="28"/>
+        </w:rPr>
+        <w:t>27. Kiểm tra heading: mỗi trang chỉ có đúng 1 thẻ &lt;h1&gt;. Sửa nếu sai.</w:t>
+      </w:r>
+    </w:p>
+    <w:p>
+      <w:pPr>
+        <w:rPr>
+          <w:b/>
+          <w:bCs/>
+          <w:szCs w:val="28"/>
+        </w:rPr>
+      </w:pPr>
+      <w:r>
+        <w:rPr>
+          <w:b/>
+          <w:bCs/>
+          <w:szCs w:val="28"/>
+        </w:rPr>
+        <w:lastRenderedPageBreak/>
+        <w:drawing>
+          <wp:inline distT="0" distB="0" distL="0" distR="0" wp14:anchorId="0BF64247" wp14:editId="1E5E8804">
+            <wp:extent cx="5760720" cy="2555240"/>
+            <wp:effectExtent l="0" t="0" r="0" b="0"/>
+            <wp:docPr id="1134492505" name="Picture 1"/>
+            <wp:cNvGraphicFramePr>
+              <a:graphicFrameLocks xmlns:a="http://schemas.openxmlformats.org/drawingml/2006/main" noChangeAspect="1"/>
+            </wp:cNvGraphicFramePr>
+            <a:graphic xmlns:a="http://schemas.openxmlformats.org/drawingml/2006/main">
+              <a:graphicData uri="http://schemas.openxmlformats.org/drawingml/2006/picture">
+                <pic:pic xmlns:pic="http://schemas.openxmlformats.org/drawingml/2006/picture">
+                  <pic:nvPicPr>
+                    <pic:cNvPr id="1134492505" name=""/>
+                    <pic:cNvPicPr/>
+                  </pic:nvPicPr>
+                  <pic:blipFill>
+                    <a:blip r:embed="rId29"/>
+                    <a:stretch>
+                      <a:fillRect/>
+                    </a:stretch>
+                  </pic:blipFill>
+                  <pic:spPr>
+                    <a:xfrm>
+                      <a:off x="0" y="0"/>
+                      <a:ext cx="5760720" cy="2555240"/>
+                    </a:xfrm>
+                    <a:prstGeom prst="rect">
+                      <a:avLst/>
+                    </a:prstGeom>
+                  </pic:spPr>
+                </pic:pic>
+              </a:graphicData>
+            </a:graphic>
+          </wp:inline>
+        </w:drawing>
+      </w:r>
+    </w:p>
+    <w:p>
+      <w:pPr>
+        <w:rPr>
+          <w:b/>
+          <w:bCs/>
+          <w:szCs w:val="28"/>
+        </w:rPr>
+      </w:pPr>
+      <w:r>
+        <w:rPr>
+          <w:b/>
+          <w:bCs/>
+          <w:szCs w:val="28"/>
+        </w:rPr>
+        <w:drawing>
+          <wp:inline distT="0" distB="0" distL="0" distR="0" wp14:anchorId="60C181B9" wp14:editId="1AE62C5E">
+            <wp:extent cx="5760720" cy="1642110"/>
+            <wp:effectExtent l="0" t="0" r="0" b="0"/>
+            <wp:docPr id="1866361665" name="Picture 1"/>
+            <wp:cNvGraphicFramePr>
+              <a:graphicFrameLocks xmlns:a="http://schemas.openxmlformats.org/drawingml/2006/main" noChangeAspect="1"/>
+            </wp:cNvGraphicFramePr>
+            <a:graphic xmlns:a="http://schemas.openxmlformats.org/drawingml/2006/main">
+              <a:graphicData uri="http://schemas.openxmlformats.org/drawingml/2006/picture">
+                <pic:pic xmlns:pic="http://schemas.openxmlformats.org/drawingml/2006/picture">
+                  <pic:nvPicPr>
+                    <pic:cNvPr id="1866361665" name=""/>
+                    <pic:cNvPicPr/>
+                  </pic:nvPicPr>
+                  <pic:blipFill>
+                    <a:blip r:embed="rId30"/>
+                    <a:stretch>
+                      <a:fillRect/>
+                    </a:stretch>
+                  </pic:blipFill>
+                  <pic:spPr>
+                    <a:xfrm>
+                      <a:off x="0" y="0"/>
+                      <a:ext cx="5760720" cy="1642110"/>
+                    </a:xfrm>
+                    <a:prstGeom prst="rect">
+                      <a:avLst/>
+                    </a:prstGeom>
+                  </pic:spPr>
+                </pic:pic>
+              </a:graphicData>
+            </a:graphic>
+          </wp:inline>
+        </w:drawing>
+      </w:r>
+    </w:p>
+    <w:p>
+      <w:pPr>
+        <w:rPr>
+          <w:b/>
+          <w:bCs/>
+          <w:szCs w:val="28"/>
+        </w:rPr>
+      </w:pPr>
+      <w:r>
+        <w:rPr>
+          <w:b/>
+          <w:bCs/>
+          <w:szCs w:val="28"/>
+        </w:rPr>
+        <w:drawing>
+          <wp:inline distT="0" distB="0" distL="0" distR="0" wp14:anchorId="19D5ABC3" wp14:editId="4CD1C21A">
+            <wp:extent cx="5760720" cy="1882775"/>
+            <wp:effectExtent l="0" t="0" r="0" b="3175"/>
+            <wp:docPr id="1945050855" name="Picture 1"/>
+            <wp:cNvGraphicFramePr>
+              <a:graphicFrameLocks xmlns:a="http://schemas.openxmlformats.org/drawingml/2006/main" noChangeAspect="1"/>
+            </wp:cNvGraphicFramePr>
+            <a:graphic xmlns:a="http://schemas.openxmlformats.org/drawingml/2006/main">
+              <a:graphicData uri="http://schemas.openxmlformats.org/drawingml/2006/picture">
+                <pic:pic xmlns:pic="http://schemas.openxmlformats.org/drawingml/2006/picture">
+                  <pic:nvPicPr>
+                    <pic:cNvPr id="1945050855" name=""/>
+                    <pic:cNvPicPr/>
+                  </pic:nvPicPr>
+                  <pic:blipFill>
+                    <a:blip r:embed="rId31"/>
+                    <a:stretch>
+                      <a:fillRect/>
+                    </a:stretch>
+                  </pic:blipFill>
+                  <pic:spPr>
+                    <a:xfrm>
+                      <a:off x="0" y="0"/>
+                      <a:ext cx="5760720" cy="1882775"/>
+                    </a:xfrm>
+                    <a:prstGeom prst="rect">
+                      <a:avLst/>
+                    </a:prstGeom>
+                  </pic:spPr>
+                </pic:pic>
+              </a:graphicData>
+            </a:graphic>
+          </wp:inline>
+        </w:drawing>
+      </w:r>
+    </w:p>
+    <w:p>
+      <w:pPr>
+        <w:rPr>
+          <w:b/>
+          <w:bCs/>
+          <w:szCs w:val="28"/>
+        </w:rPr>
+      </w:pPr>
+      <w:r>
+        <w:rPr>
+          <w:b/>
+          <w:bCs/>
+          <w:szCs w:val="28"/>
+        </w:rPr>
+        <w:t>28. Kiểm tra: tất cả &lt;img&gt; có alt text mô tả rõ (không phải alt="image" hay alt</w:t>
+      </w:r>
+      <w:r>
+        <w:rPr>
+          <w:b/>
+          <w:bCs/>
+          <w:szCs w:val="28"/>
+        </w:rPr>
+        <w:t xml:space="preserve"> </w:t>
+      </w:r>
+      <w:r>
+        <w:rPr>
+          <w:b/>
+          <w:bCs/>
+          <w:szCs w:val="28"/>
+        </w:rPr>
+        <w:t>bỏ trống).</w:t>
+      </w:r>
+    </w:p>
+    <w:p>
+      <w:pPr>
+        <w:rPr>
+          <w:b/>
+          <w:bCs/>
+          <w:szCs w:val="28"/>
+        </w:rPr>
+      </w:pPr>
+      <w:r>
+        <w:rPr>
+          <w:b/>
+          <w:bCs/>
+          <w:noProof/>
+          <w:szCs w:val="28"/>
+        </w:rPr>
+        <w:drawing>
+          <wp:inline distT="0" distB="0" distL="0" distR="0" wp14:anchorId="09338EE7" wp14:editId="19FDE539">
+            <wp:extent cx="5620039" cy="711237"/>
+            <wp:effectExtent l="0" t="0" r="0" b="0"/>
+            <wp:docPr id="225254768" name="Picture 1"/>
+            <wp:cNvGraphicFramePr>
+              <a:graphicFrameLocks xmlns:a="http://schemas.openxmlformats.org/drawingml/2006/main" noChangeAspect="1"/>
+            </wp:cNvGraphicFramePr>
+            <a:graphic xmlns:a="http://schemas.openxmlformats.org/drawingml/2006/main">
+              <a:graphicData uri="http://schemas.openxmlformats.org/drawingml/2006/picture">
+                <pic:pic xmlns:pic="http://schemas.openxmlformats.org/drawingml/2006/picture">
+                  <pic:nvPicPr>
+                    <pic:cNvPr id="225254768" name=""/>
+                    <pic:cNvPicPr/>
+                  </pic:nvPicPr>
+                  <pic:blipFill>
+                    <a:blip r:embed="rId32"/>
+                    <a:stretch>
+                      <a:fillRect/>
+                    </a:stretch>
+                  </pic:blipFill>
+                  <pic:spPr>
+                    <a:xfrm>
+                      <a:off x="0" y="0"/>
+                      <a:ext cx="5620039" cy="711237"/>
+                    </a:xfrm>
+                    <a:prstGeom prst="rect">
+                      <a:avLst/>
+                    </a:prstGeom>
+                  </pic:spPr>
+                </pic:pic>
+              </a:graphicData>
+            </a:graphic>
+          </wp:inline>
+        </w:drawing>
+      </w:r>
+    </w:p>
+    <w:p>
+      <w:pPr>
+        <w:rPr>
+          <w:b/>
+          <w:bCs/>
+          <w:szCs w:val="28"/>
+        </w:rPr>
+      </w:pPr>
+      <w:r>
+        <w:rPr>
+          <w:b/>
+          <w:bCs/>
+          <w:szCs w:val="28"/>
+        </w:rPr>
+        <w:t>29. Kiểm tra: tất cả &lt;input&gt; trong form có &lt;label&gt; với for trỏ đúng id.</w:t>
+      </w:r>
+    </w:p>
+    <w:p>
+      <w:pPr>
+        <w:rPr>
+          <w:b/>
+          <w:bCs/>
+          <w:szCs w:val="28"/>
+        </w:rPr>
+      </w:pPr>
+      <w:r>
+        <w:rPr>
+          <w:b/>
+          <w:bCs/>
+          <w:szCs w:val="28"/>
+        </w:rPr>
+        <w:lastRenderedPageBreak/>
+        <w:drawing>
+          <wp:inline distT="0" distB="0" distL="0" distR="0" wp14:anchorId="44A81462" wp14:editId="79219B5A">
+            <wp:extent cx="5760720" cy="3115310"/>
+            <wp:effectExtent l="0" t="0" r="0" b="8890"/>
+            <wp:docPr id="1195848903" name="Picture 1"/>
+            <wp:cNvGraphicFramePr>
+              <a:graphicFrameLocks xmlns:a="http://schemas.openxmlformats.org/drawingml/2006/main" noChangeAspect="1"/>
+            </wp:cNvGraphicFramePr>
+            <a:graphic xmlns:a="http://schemas.openxmlformats.org/drawingml/2006/main">
+              <a:graphicData uri="http://schemas.openxmlformats.org/drawingml/2006/picture">
+                <pic:pic xmlns:pic="http://schemas.openxmlformats.org/drawingml/2006/picture">
+                  <pic:nvPicPr>
+                    <pic:cNvPr id="1195848903" name=""/>
+                    <pic:cNvPicPr/>
+                  </pic:nvPicPr>
+                  <pic:blipFill>
+                    <a:blip r:embed="rId33"/>
+                    <a:stretch>
+                      <a:fillRect/>
+                    </a:stretch>
+                  </pic:blipFill>
+                  <pic:spPr>
+                    <a:xfrm>
+                      <a:off x="0" y="0"/>
+                      <a:ext cx="5760720" cy="3115310"/>
+                    </a:xfrm>
+                    <a:prstGeom prst="rect">
+                      <a:avLst/>
+                    </a:prstGeom>
+                  </pic:spPr>
+                </pic:pic>
+              </a:graphicData>
+            </a:graphic>
+          </wp:inline>
+        </w:drawing>
+      </w:r>
+    </w:p>
+    <w:p>
+      <w:pPr>
+        <w:rPr>
+          <w:b/>
+          <w:bCs/>
+          <w:szCs w:val="28"/>
+        </w:rPr>
+      </w:pPr>
+    </w:p>
+    <w:p>
+      <w:pPr>
+        <w:rPr>
+          <w:b/>
+          <w:bCs/>
+          <w:szCs w:val="28"/>
+        </w:rPr>
+      </w:pPr>
+      <w:r>
+        <w:rPr>
+          <w:b/>
+          <w:bCs/>
+          <w:szCs w:val="28"/>
+        </w:rPr>
+        <w:t>30. Chạy git add . → git commit -m "lab 2: ..." → git push.</w:t>
+      </w:r>
+    </w:p>
+    <w:p>
+      <w:pPr>
+        <w:rPr>
+          <w:b/>
+          <w:bCs/>
+          <w:szCs w:val="28"/>
+        </w:rPr>
+      </w:pPr>
+      <w:r>
+        <w:rPr>
+          <w:b/>
+          <w:bCs/>
+          <w:szCs w:val="28"/>
+        </w:rPr>
+        <w:drawing>
+          <wp:inline distT="0" distB="0" distL="0" distR="0" wp14:anchorId="62D05462" wp14:editId="6EDC311C">
+            <wp:extent cx="5760720" cy="3300730"/>
+            <wp:effectExtent l="0" t="0" r="0" b="0"/>
+            <wp:docPr id="1560230936" name="Picture 1"/>
+            <wp:cNvGraphicFramePr>
+              <a:graphicFrameLocks xmlns:a="http://schemas.openxmlformats.org/drawingml/2006/main" noChangeAspect="1"/>
+            </wp:cNvGraphicFramePr>
+            <a:graphic xmlns:a="http://schemas.openxmlformats.org/drawingml/2006/main">
+              <a:graphicData uri="http://schemas.openxmlformats.org/drawingml/2006/picture">
+                <pic:pic xmlns:pic="http://schemas.openxmlformats.org/drawingml/2006/picture">
+                  <pic:nvPicPr>
+                    <pic:cNvPr id="1560230936" name=""/>
+                    <pic:cNvPicPr/>
+                  </pic:nvPicPr>
+                  <pic:blipFill>
+                    <a:blip r:embed="rId34"/>
+                    <a:stretch>
+                      <a:fillRect/>
+                    </a:stretch>
+                  </pic:blipFill>
+                  <pic:spPr>
+                    <a:xfrm>
+                      <a:off x="0" y="0"/>
+                      <a:ext cx="5760720" cy="3300730"/>
+                    </a:xfrm>
+                    <a:prstGeom prst="rect">
+                      <a:avLst/>
+                    </a:prstGeom>
+                  </pic:spPr>
+                </pic:pic>
+              </a:graphicData>
+            </a:graphic>
+          </wp:inline>
+        </w:drawing>
+      </w:r>
+    </w:p>
+    <w:p>
+      <w:pPr>
+        <w:rPr>
+          <w:b/>
+          <w:bCs/>
+          <w:szCs w:val="28"/>
+        </w:rPr>
+      </w:pPr>
+      <w:r>
+        <w:rPr>
+          <w:b/>
+          <w:bCs/>
+          <w:szCs w:val="28"/>
+        </w:rPr>
+        <w:t>31. Vào GitHub, xác nhận: repo hiển thị đủ index.html, about.html,</w:t>
+      </w:r>
+    </w:p>
+    <w:p>
+      <w:pPr>
+        <w:rPr>
+          <w:b/>
+          <w:bCs/>
+          <w:szCs w:val="28"/>
+        </w:rPr>
+      </w:pPr>
+      <w:r>
+        <w:rPr>
+          <w:b/>
+          <w:bCs/>
+          <w:szCs w:val="28"/>
+        </w:rPr>
+        <w:t>contact.html, css/, images/.</w:t>
+      </w:r>
+    </w:p>
+    <w:p>
+      <w:pPr>
+        <w:rPr>
+          <w:b/>
+          <w:bCs/>
+          <w:szCs w:val="28"/>
+        </w:rPr>
+      </w:pPr>
+      <w:r>
+        <w:rPr>
+          <w:b/>
+          <w:bCs/>
+          <w:szCs w:val="28"/>
+        </w:rPr>
+        <w:lastRenderedPageBreak/>
+        <w:drawing>
+          <wp:inline distT="0" distB="0" distL="0" distR="0" wp14:anchorId="0668F833" wp14:editId="1EB890B3">
+            <wp:extent cx="5760720" cy="3242945"/>
+            <wp:effectExtent l="0" t="0" r="0" b="0"/>
+            <wp:docPr id="1820083829" name="Picture 1"/>
+            <wp:cNvGraphicFramePr>
+              <a:graphicFrameLocks xmlns:a="http://schemas.openxmlformats.org/drawingml/2006/main" noChangeAspect="1"/>
+            </wp:cNvGraphicFramePr>
+            <a:graphic xmlns:a="http://schemas.openxmlformats.org/drawingml/2006/main">
+              <a:graphicData uri="http://schemas.openxmlformats.org/drawingml/2006/picture">
+                <pic:pic xmlns:pic="http://schemas.openxmlformats.org/drawingml/2006/picture">
+                  <pic:nvPicPr>
+                    <pic:cNvPr id="1820083829" name=""/>
+                    <pic:cNvPicPr/>
+                  </pic:nvPicPr>
+                  <pic:blipFill>
+                    <a:blip r:embed="rId35"/>
+                    <a:stretch>
+                      <a:fillRect/>
+                    </a:stretch>
+                  </pic:blipFill>
+                  <pic:spPr>
+                    <a:xfrm>
+                      <a:off x="0" y="0"/>
+                      <a:ext cx="5760720" cy="3242945"/>
+                    </a:xfrm>
+                    <a:prstGeom prst="rect">
+                      <a:avLst/>
+                    </a:prstGeom>
+                  </pic:spPr>
+                </pic:pic>
+              </a:graphicData>
+            </a:graphic>
+          </wp:inline>
+        </w:drawing>
+      </w:r>
+    </w:p>
+    <w:p>
+      <w:pPr>
+        <w:rPr>
+          <w:b/>
+          <w:bCs/>
+          <w:szCs w:val="28"/>
+        </w:rPr>
+      </w:pPr>
+      <w:r>
+        <w:rPr>
+          <w:b/>
+          <w:bCs/>
+          <w:szCs w:val="28"/>
+        </w:rPr>
+        <w:t>32. Dùng git log --oneline: nên thấy ít nhất 2 commit (lab 1 và lab 2).</w:t>
+      </w:r>
+    </w:p>
+    <w:p>
+      <w:pPr>
+        <w:rPr>
+          <w:b/>
+          <w:bCs/>
+          <w:szCs w:val="28"/>
+        </w:rPr>
+      </w:pPr>
+      <w:r>
+        <w:rPr>
+          <w:b/>
+          <w:bCs/>
+          <w:szCs w:val="28"/>
+        </w:rPr>
+        <w:t>33. Copy link repo GitHub → gửi vào group chat lớp. Đây là bài nộp Lab 2.</w:t>
+      </w:r>
+    </w:p>
+    <w:p>
+      <w:pPr>
+        <w:rPr>
+          <w:b/>
+          <w:bCs/>
+          <w:szCs w:val="28"/>
+        </w:rPr>
+      </w:pPr>
+      <w:r>
+        <w:rPr>
+          <w:b/>
+          <w:bCs/>
+          <w:szCs w:val="28"/>
+        </w:rPr>
+        <w:t>34. (Nâng cao) Thêm &lt;meta property="og:..."&gt;, tạo README.md cập nhật</w:t>
+      </w:r>
+    </w:p>
+    <w:p>
+      <w:pPr>
+        <w:rPr>
+          <w:b/>
+          <w:bCs/>
+          <w:szCs w:val="28"/>
+        </w:rPr>
+      </w:pPr>
+      <w:r>
+        <w:rPr>
+          <w:b/>
+          <w:bCs/>
+          <w:szCs w:val="28"/>
+        </w:rPr>
+        <w:t>mô tả dự án → commit.</w:t>
+      </w:r>
+    </w:p>
+    <w:p>
+      <w:pPr>
+        <w:rPr>
+          <w:b/>
+          <w:bCs/>
+          <w:szCs w:val="28"/>
+        </w:rPr>
+      </w:pPr>
+    </w:p>
+    <w:p>
+      <w:pPr>
+        <w:rPr>
+          <w:b/>
+          <w:bCs/>
+          <w:szCs w:val="28"/>
+        </w:rPr>
+      </w:pPr>
+    </w:p>
+    <w:p>
+      <w:pPr>
+        <w:rPr>
+          <w:b/>
+          <w:bCs/>
+          <w:szCs w:val="28"/>
+        </w:rPr>
+      </w:pPr>
     </w:p>
     <w:sectPr>
       <w:pgSz w:w="11907" w:h="16840" w:code="9"/>

</xml_diff>